<commit_message>
Cap nhat Ke hoach to chuyen mon THCS, KHDH Robotics TH lop 5, thong ke cuoc thi va cac tai lieu lien quan
</commit_message>
<xml_diff>
--- a/Hệ thống mẫu văn bản/đơn xin/Đơn xin nghỉ phép-159.docx
+++ b/Hệ thống mẫu văn bản/đơn xin/Đơn xin nghỉ phép-159.docx
@@ -1,6 +1,6 @@
 
 <file path=word/document.xml><?xml version="1.0" encoding="utf-8"?>
-<w:document xmlns:wpc="http://schemas.microsoft.com/office/word/2010/wordprocessingCanvas" xmlns:cx="http://schemas.microsoft.com/office/drawing/2014/chartex" xmlns:cx1="http://schemas.microsoft.com/office/drawing/2015/9/8/chartex" xmlns:cx2="http://schemas.microsoft.com/office/drawing/2015/10/21/chartex" xmlns:cx3="http://schemas.microsoft.com/office/drawing/2016/5/9/chartex" xmlns:cx4="http://schemas.microsoft.com/office/drawing/2016/5/10/chartex" xmlns:cx5="http://schemas.microsoft.com/office/drawing/2016/5/11/chartex" xmlns:cx6="http://schemas.microsoft.com/office/drawing/2016/5/12/chartex" xmlns:cx7="http://schemas.microsoft.com/office/drawing/2016/5/13/chartex" xmlns:cx8="http://schemas.microsoft.com/office/drawing/2016/5/14/chartex" xmlns:mc="http://schemas.openxmlformats.org/markup-compatibility/2006" xmlns:aink="http://schemas.microsoft.com/office/drawing/2016/ink" xmlns:am3d="http://schemas.microsoft.com/office/drawing/2017/model3d" xmlns:o="urn:schemas-microsoft-com:office:office" xmlns:oel="http://schemas.microsoft.com/office/2019/extlst" xmlns:r="http://schemas.openxmlformats.org/officeDocument/2006/relationships" xmlns:m="http://schemas.openxmlformats.org/officeDocument/2006/math" xmlns:v="urn:schemas-microsoft-com:vml" xmlns:wp14="http://schemas.microsoft.com/office/word/2010/wordprocessingDrawing" xmlns:wp="http://schemas.openxmlformats.org/drawingml/2006/wordprocessingDrawing" xmlns:w10="urn:schemas-microsoft-com:office:word" xmlns:w="http://schemas.openxmlformats.org/wordprocessingml/2006/main" xmlns:w14="http://schemas.microsoft.com/office/word/2010/wordml" xmlns:w15="http://schemas.microsoft.com/office/word/2012/wordml" xmlns:w16cei="http://schemas.microsoft.com/office/word/2026/wordml/cei" xmlns:w16cex="http://schemas.microsoft.com/office/word/2018/wordml/cex" xmlns:w16cid="http://schemas.microsoft.com/office/word/2016/wordml/cid" xmlns:w16="http://schemas.microsoft.com/office/word/2018/wordml" xmlns:w16du="http://schemas.microsoft.com/office/word/2023/wordml/word16du" xmlns:w16sdtdh="http://schemas.microsoft.com/office/word/2020/wordml/sdtdatahash" xmlns:w16sdtfl="http://schemas.microsoft.com/office/word/2024/wordml/sdtformatlock" xmlns:w16se="http://schemas.microsoft.com/office/word/2015/wordml/symex" xmlns:wpg="http://schemas.microsoft.com/office/word/2010/wordprocessingGroup" xmlns:wpi="http://schemas.microsoft.com/office/word/2010/wordprocessingInk" xmlns:wne="http://schemas.microsoft.com/office/word/2006/wordml" xmlns:wps="http://schemas.microsoft.com/office/word/2010/wordprocessingShape" mc:Ignorable="w14 w15 w16se w16cid w16 w16cex w16sdtdh w16sdtfl w16du wp14">
+<w:document xmlns:wpc="http://schemas.microsoft.com/office/word/2010/wordprocessingCanvas" xmlns:cx="http://schemas.microsoft.com/office/drawing/2014/chartex" xmlns:cx1="http://schemas.microsoft.com/office/drawing/2015/9/8/chartex" xmlns:cx2="http://schemas.microsoft.com/office/drawing/2015/10/21/chartex" xmlns:cx3="http://schemas.microsoft.com/office/drawing/2016/5/9/chartex" xmlns:cx4="http://schemas.microsoft.com/office/drawing/2016/5/10/chartex" xmlns:cx5="http://schemas.microsoft.com/office/drawing/2016/5/11/chartex" xmlns:cx6="http://schemas.microsoft.com/office/drawing/2016/5/12/chartex" xmlns:cx7="http://schemas.microsoft.com/office/drawing/2016/5/13/chartex" xmlns:cx8="http://schemas.microsoft.com/office/drawing/2016/5/14/chartex" xmlns:mc="http://schemas.openxmlformats.org/markup-compatibility/2006" xmlns:aink="http://schemas.microsoft.com/office/drawing/2016/ink" xmlns:am3d="http://schemas.microsoft.com/office/drawing/2017/model3d" xmlns:o="urn:schemas-microsoft-com:office:office" xmlns:oel="http://schemas.microsoft.com/office/2019/extlst" xmlns:r="http://schemas.openxmlformats.org/officeDocument/2006/relationships" xmlns:m="http://schemas.openxmlformats.org/officeDocument/2006/math" xmlns:v="urn:schemas-microsoft-com:vml" xmlns:wp14="http://schemas.microsoft.com/office/word/2010/wordprocessingDrawing" xmlns:wp="http://schemas.openxmlformats.org/drawingml/2006/wordprocessingDrawing" xmlns:w10="urn:schemas-microsoft-com:office:word" xmlns:w="http://schemas.openxmlformats.org/wordprocessingml/2006/main" xmlns:w14="http://schemas.microsoft.com/office/word/2010/wordml" xmlns:w15="http://schemas.microsoft.com/office/word/2012/wordml" xmlns:w16cex="http://schemas.microsoft.com/office/word/2018/wordml/cex" xmlns:w16cid="http://schemas.microsoft.com/office/word/2016/wordml/cid" xmlns:w16="http://schemas.microsoft.com/office/word/2018/wordml" xmlns:w16du="http://schemas.microsoft.com/office/word/2023/wordml/word16du" xmlns:w16sdtdh="http://schemas.microsoft.com/office/word/2020/wordml/sdtdatahash" xmlns:w16sdtfl="http://schemas.microsoft.com/office/word/2024/wordml/sdtformatlock" xmlns:w16se="http://schemas.microsoft.com/office/word/2015/wordml/symex" xmlns:wpg="http://schemas.microsoft.com/office/word/2010/wordprocessingGroup" xmlns:wpi="http://schemas.microsoft.com/office/word/2010/wordprocessingInk" xmlns:wne="http://schemas.microsoft.com/office/word/2006/wordml" xmlns:wps="http://schemas.microsoft.com/office/word/2010/wordprocessingShape" mc:Ignorable="w14 w15 w16se w16cid w16 w16cex w16sdtdh w16sdtfl w16du wp14">
   <w:body>
     <w:p>
       <w:pPr>
@@ -244,7 +244,25 @@
           <w:sz w:val="26"/>
           <w:szCs w:val="26"/>
         </w:rPr>
-        <w:t xml:space="preserve">ĐƠN XIN NGHỈ </w:t>
+        <w:t xml:space="preserve">ĐƠN XIN </w:t>
+      </w:r>
+      <w:r>
+        <w:rPr>
+          <w:rFonts w:ascii="Times New Roman" w:eastAsia="Times New Roman" w:hAnsi="Times New Roman" w:cs="Times New Roman"/>
+          <w:b/>
+          <w:sz w:val="26"/>
+          <w:szCs w:val="26"/>
+        </w:rPr>
+        <w:t>ĐẾN MUỘN</w:t>
+      </w:r>
+      <w:r>
+        <w:rPr>
+          <w:rFonts w:ascii="Times New Roman" w:eastAsia="Times New Roman" w:hAnsi="Times New Roman" w:cs="Times New Roman"/>
+          <w:b/>
+          <w:sz w:val="26"/>
+          <w:szCs w:val="26"/>
+        </w:rPr>
+        <w:t xml:space="preserve"> </w:t>
       </w:r>
     </w:p>
     <w:p>
@@ -601,7 +619,39 @@
           <w:sz w:val="26"/>
           <w:szCs w:val="26"/>
         </w:rPr>
-        <w:t xml:space="preserve"> 10/08/2026</w:t>
+        <w:t xml:space="preserve"> 1</w:t>
+      </w:r>
+      <w:r>
+        <w:rPr>
+          <w:rFonts w:ascii="Times New Roman" w:eastAsia="Times New Roman" w:hAnsi="Times New Roman" w:cs="Times New Roman"/>
+          <w:sz w:val="26"/>
+          <w:szCs w:val="26"/>
+        </w:rPr>
+        <w:t>5</w:t>
+      </w:r>
+      <w:r>
+        <w:rPr>
+          <w:rFonts w:ascii="Times New Roman" w:eastAsia="Times New Roman" w:hAnsi="Times New Roman" w:cs="Times New Roman"/>
+          <w:sz w:val="26"/>
+          <w:szCs w:val="26"/>
+        </w:rPr>
+        <w:t>/0</w:t>
+      </w:r>
+      <w:r>
+        <w:rPr>
+          <w:rFonts w:ascii="Times New Roman" w:eastAsia="Times New Roman" w:hAnsi="Times New Roman" w:cs="Times New Roman"/>
+          <w:sz w:val="26"/>
+          <w:szCs w:val="26"/>
+        </w:rPr>
+        <w:t>9</w:t>
+      </w:r>
+      <w:r>
+        <w:rPr>
+          <w:rFonts w:ascii="Times New Roman" w:eastAsia="Times New Roman" w:hAnsi="Times New Roman" w:cs="Times New Roman"/>
+          <w:sz w:val="26"/>
+          <w:szCs w:val="26"/>
+        </w:rPr>
+        <w:t>/2026</w:t>
       </w:r>
     </w:p>
     <w:p>
@@ -805,7 +855,7 @@
                     </wp:anchor>
                   </w:drawing>
                 </mc:Choice>
-                <mc:Fallback>
+                <mc:Fallback xmlns:w16cei="http://schemas.microsoft.com/office/word/2026/wordml/cei">
                   <w:pict>
                     <v:rect w14:anchorId="0796963C" id="Rectangle 1032" o:spid="_x0000_s1026" style="position:absolute;margin-left:10pt;margin-top:5pt;width:23.25pt;height:18pt;z-index:251658240;visibility:visible;mso-wrap-style:square;mso-wrap-distance-left:9pt;mso-wrap-distance-top:0;mso-wrap-distance-right:9pt;mso-wrap-distance-bottom:0;mso-position-horizontal:absolute;mso-position-horizontal-relative:text;mso-position-vertical:absolute;mso-position-vertical-relative:text;v-text-anchor:middle" o:gfxdata="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">
                       <v:stroke startarrowwidth="narrow" startarrowlength="short" endarrowwidth="narrow" endarrowlength="short"/>
@@ -941,7 +991,7 @@
                     </wp:anchor>
                   </w:drawing>
                 </mc:Choice>
-                <mc:Fallback>
+                <mc:Fallback xmlns:w16cei="http://schemas.microsoft.com/office/word/2026/wordml/cei">
                   <w:pict>
                     <v:rect w14:anchorId="38158CA2" id="Rectangle 1031" o:spid="_x0000_s1027" style="position:absolute;margin-left:10pt;margin-top:5pt;width:24pt;height:17.25pt;z-index:251659264;visibility:visible;mso-wrap-style:square;mso-wrap-distance-left:9pt;mso-wrap-distance-top:0;mso-wrap-distance-right:9pt;mso-wrap-distance-bottom:0;mso-position-horizontal:absolute;mso-position-horizontal-relative:text;mso-position-vertical:absolute;mso-position-vertical-relative:text;v-text-anchor:middle" o:gfxdata="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">
                       <v:stroke startarrowwidth="narrow" startarrowlength="short" endarrowwidth="narrow" endarrowlength="short"/>
@@ -1077,7 +1127,7 @@
                     </wp:anchor>
                   </w:drawing>
                 </mc:Choice>
-                <mc:Fallback>
+                <mc:Fallback xmlns:w16cei="http://schemas.microsoft.com/office/word/2026/wordml/cei">
                   <w:pict>
                     <v:rect w14:anchorId="6090D9A0" id="Rectangle 1034" o:spid="_x0000_s1028" style="position:absolute;margin-left:10pt;margin-top:3pt;width:24pt;height:20.25pt;z-index:251660288;visibility:visible;mso-wrap-style:square;mso-wrap-distance-left:9pt;mso-wrap-distance-top:0;mso-wrap-distance-right:9pt;mso-wrap-distance-bottom:0;mso-position-horizontal:absolute;mso-position-horizontal-relative:text;mso-position-vertical:absolute;mso-position-vertical-relative:text;v-text-anchor:middle" o:gfxdata="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">
                       <v:stroke startarrowwidth="narrow" startarrowlength="short" endarrowwidth="narrow" endarrowlength="short"/>
@@ -1222,7 +1272,7 @@
                     </wp:anchor>
                   </w:drawing>
                 </mc:Choice>
-                <mc:Fallback>
+                <mc:Fallback xmlns:w16cei="http://schemas.microsoft.com/office/word/2026/wordml/cei">
                   <w:pict>
                     <v:rect w14:anchorId="1A188348" id="Rectangle 1033" o:spid="_x0000_s1029" style="position:absolute;margin-left:10pt;margin-top:3pt;width:24pt;height:18.75pt;z-index:251661312;visibility:visible;mso-wrap-style:square;mso-wrap-distance-left:9pt;mso-wrap-distance-top:0;mso-wrap-distance-right:9pt;mso-wrap-distance-bottom:0;mso-position-horizontal:absolute;mso-position-horizontal-relative:text;mso-position-vertical:absolute;mso-position-vertical-relative:text;v-text-anchor:middle" o:gfxdata="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">
                       <v:stroke startarrowwidth="narrow" startarrowlength="short" endarrowwidth="narrow" endarrowlength="short"/>
@@ -1282,25 +1332,7 @@
           <w:sz w:val="26"/>
           <w:szCs w:val="26"/>
         </w:rPr>
-        <w:t>(</w:t>
-      </w:r>
-      <w:r>
-        <w:rPr>
-          <w:rFonts w:ascii="Times New Roman" w:eastAsia="Times New Roman" w:hAnsi="Times New Roman" w:cs="Times New Roman"/>
-          <w:color w:val="212121"/>
-          <w:sz w:val="26"/>
-          <w:szCs w:val="26"/>
-        </w:rPr>
-        <w:t>Có biên bản bàn giao kèm theo</w:t>
-      </w:r>
-      <w:r>
-        <w:rPr>
-          <w:rFonts w:ascii="Times New Roman" w:eastAsia="Times New Roman" w:hAnsi="Times New Roman" w:cs="Times New Roman"/>
-          <w:color w:val="212121"/>
-          <w:sz w:val="26"/>
-          <w:szCs w:val="26"/>
-        </w:rPr>
-        <w:t>)</w:t>
+        <w:t>(Có biên bản bàn giao kèm theo)</w:t>
       </w:r>
       <w:r>
         <w:rPr>
@@ -2391,7 +2423,7 @@
 </file>
 
 <file path=word/endnotes.xml><?xml version="1.0" encoding="utf-8"?>
-<w:endnotes xmlns:wpc="http://schemas.microsoft.com/office/word/2010/wordprocessingCanvas" xmlns:cx="http://schemas.microsoft.com/office/drawing/2014/chartex" xmlns:cx1="http://schemas.microsoft.com/office/drawing/2015/9/8/chartex" xmlns:cx2="http://schemas.microsoft.com/office/drawing/2015/10/21/chartex" xmlns:cx3="http://schemas.microsoft.com/office/drawing/2016/5/9/chartex" xmlns:cx4="http://schemas.microsoft.com/office/drawing/2016/5/10/chartex" xmlns:cx5="http://schemas.microsoft.com/office/drawing/2016/5/11/chartex" xmlns:cx6="http://schemas.microsoft.com/office/drawing/2016/5/12/chartex" xmlns:cx7="http://schemas.microsoft.com/office/drawing/2016/5/13/chartex" xmlns:cx8="http://schemas.microsoft.com/office/drawing/2016/5/14/chartex" xmlns:mc="http://schemas.openxmlformats.org/markup-compatibility/2006" xmlns:aink="http://schemas.microsoft.com/office/drawing/2016/ink" xmlns:am3d="http://schemas.microsoft.com/office/drawing/2017/model3d" xmlns:o="urn:schemas-microsoft-com:office:office" xmlns:oel="http://schemas.microsoft.com/office/2019/extlst" xmlns:r="http://schemas.openxmlformats.org/officeDocument/2006/relationships" xmlns:m="http://schemas.openxmlformats.org/officeDocument/2006/math" xmlns:v="urn:schemas-microsoft-com:vml" xmlns:wp14="http://schemas.microsoft.com/office/word/2010/wordprocessingDrawing" xmlns:wp="http://schemas.openxmlformats.org/drawingml/2006/wordprocessingDrawing" xmlns:w10="urn:schemas-microsoft-com:office:word" xmlns:w="http://schemas.openxmlformats.org/wordprocessingml/2006/main" xmlns:w14="http://schemas.microsoft.com/office/word/2010/wordml" xmlns:w15="http://schemas.microsoft.com/office/word/2012/wordml" xmlns:w16cei="http://schemas.microsoft.com/office/word/2026/wordml/cei" xmlns:w16cex="http://schemas.microsoft.com/office/word/2018/wordml/cex" xmlns:w16cid="http://schemas.microsoft.com/office/word/2016/wordml/cid" xmlns:w16="http://schemas.microsoft.com/office/word/2018/wordml" xmlns:w16du="http://schemas.microsoft.com/office/word/2023/wordml/word16du" xmlns:w16sdtdh="http://schemas.microsoft.com/office/word/2020/wordml/sdtdatahash" xmlns:w16sdtfl="http://schemas.microsoft.com/office/word/2024/wordml/sdtformatlock" xmlns:w16se="http://schemas.microsoft.com/office/word/2015/wordml/symex" xmlns:wpg="http://schemas.microsoft.com/office/word/2010/wordprocessingGroup" xmlns:wpi="http://schemas.microsoft.com/office/word/2010/wordprocessingInk" xmlns:wne="http://schemas.microsoft.com/office/word/2006/wordml" xmlns:wps="http://schemas.microsoft.com/office/word/2010/wordprocessingShape" mc:Ignorable="w14 w15 w16se w16cid w16 w16cex w16sdtdh w16sdtfl w16du wp14">
+<w:endnotes xmlns:wpc="http://schemas.microsoft.com/office/word/2010/wordprocessingCanvas" xmlns:cx="http://schemas.microsoft.com/office/drawing/2014/chartex" xmlns:cx1="http://schemas.microsoft.com/office/drawing/2015/9/8/chartex" xmlns:cx2="http://schemas.microsoft.com/office/drawing/2015/10/21/chartex" xmlns:cx3="http://schemas.microsoft.com/office/drawing/2016/5/9/chartex" xmlns:cx4="http://schemas.microsoft.com/office/drawing/2016/5/10/chartex" xmlns:cx5="http://schemas.microsoft.com/office/drawing/2016/5/11/chartex" xmlns:cx6="http://schemas.microsoft.com/office/drawing/2016/5/12/chartex" xmlns:cx7="http://schemas.microsoft.com/office/drawing/2016/5/13/chartex" xmlns:cx8="http://schemas.microsoft.com/office/drawing/2016/5/14/chartex" xmlns:mc="http://schemas.openxmlformats.org/markup-compatibility/2006" xmlns:aink="http://schemas.microsoft.com/office/drawing/2016/ink" xmlns:am3d="http://schemas.microsoft.com/office/drawing/2017/model3d" xmlns:o="urn:schemas-microsoft-com:office:office" xmlns:oel="http://schemas.microsoft.com/office/2019/extlst" xmlns:r="http://schemas.openxmlformats.org/officeDocument/2006/relationships" xmlns:m="http://schemas.openxmlformats.org/officeDocument/2006/math" xmlns:v="urn:schemas-microsoft-com:vml" xmlns:wp14="http://schemas.microsoft.com/office/word/2010/wordprocessingDrawing" xmlns:wp="http://schemas.openxmlformats.org/drawingml/2006/wordprocessingDrawing" xmlns:w10="urn:schemas-microsoft-com:office:word" xmlns:w="http://schemas.openxmlformats.org/wordprocessingml/2006/main" xmlns:w14="http://schemas.microsoft.com/office/word/2010/wordml" xmlns:w15="http://schemas.microsoft.com/office/word/2012/wordml" xmlns:w16cex="http://schemas.microsoft.com/office/word/2018/wordml/cex" xmlns:w16cid="http://schemas.microsoft.com/office/word/2016/wordml/cid" xmlns:w16="http://schemas.microsoft.com/office/word/2018/wordml" xmlns:w16du="http://schemas.microsoft.com/office/word/2023/wordml/word16du" xmlns:w16sdtdh="http://schemas.microsoft.com/office/word/2020/wordml/sdtdatahash" xmlns:w16sdtfl="http://schemas.microsoft.com/office/word/2024/wordml/sdtformatlock" xmlns:w16se="http://schemas.microsoft.com/office/word/2015/wordml/symex" xmlns:wpg="http://schemas.microsoft.com/office/word/2010/wordprocessingGroup" xmlns:wpi="http://schemas.microsoft.com/office/word/2010/wordprocessingInk" xmlns:wne="http://schemas.microsoft.com/office/word/2006/wordml" xmlns:wps="http://schemas.microsoft.com/office/word/2010/wordprocessingShape" mc:Ignorable="w14 w15 w16se w16cid w16 w16cex w16sdtdh w16sdtfl w16du wp14">
   <w:endnote w:type="separator" w:id="-1">
     <w:p>
       <w:pPr>
@@ -2416,7 +2448,7 @@
 </file>
 
 <file path=word/footer1.xml><?xml version="1.0" encoding="utf-8"?>
-<w:ftr xmlns:wpc="http://schemas.microsoft.com/office/word/2010/wordprocessingCanvas" xmlns:cx="http://schemas.microsoft.com/office/drawing/2014/chartex" xmlns:cx1="http://schemas.microsoft.com/office/drawing/2015/9/8/chartex" xmlns:cx2="http://schemas.microsoft.com/office/drawing/2015/10/21/chartex" xmlns:cx3="http://schemas.microsoft.com/office/drawing/2016/5/9/chartex" xmlns:cx4="http://schemas.microsoft.com/office/drawing/2016/5/10/chartex" xmlns:cx5="http://schemas.microsoft.com/office/drawing/2016/5/11/chartex" xmlns:cx6="http://schemas.microsoft.com/office/drawing/2016/5/12/chartex" xmlns:cx7="http://schemas.microsoft.com/office/drawing/2016/5/13/chartex" xmlns:cx8="http://schemas.microsoft.com/office/drawing/2016/5/14/chartex" xmlns:mc="http://schemas.openxmlformats.org/markup-compatibility/2006" xmlns:aink="http://schemas.microsoft.com/office/drawing/2016/ink" xmlns:am3d="http://schemas.microsoft.com/office/drawing/2017/model3d" xmlns:o="urn:schemas-microsoft-com:office:office" xmlns:oel="http://schemas.microsoft.com/office/2019/extlst" xmlns:r="http://schemas.openxmlformats.org/officeDocument/2006/relationships" xmlns:m="http://schemas.openxmlformats.org/officeDocument/2006/math" xmlns:v="urn:schemas-microsoft-com:vml" xmlns:wp14="http://schemas.microsoft.com/office/word/2010/wordprocessingDrawing" xmlns:wp="http://schemas.openxmlformats.org/drawingml/2006/wordprocessingDrawing" xmlns:w10="urn:schemas-microsoft-com:office:word" xmlns:w="http://schemas.openxmlformats.org/wordprocessingml/2006/main" xmlns:w14="http://schemas.microsoft.com/office/word/2010/wordml" xmlns:w15="http://schemas.microsoft.com/office/word/2012/wordml" xmlns:w16cei="http://schemas.microsoft.com/office/word/2026/wordml/cei" xmlns:w16cex="http://schemas.microsoft.com/office/word/2018/wordml/cex" xmlns:w16cid="http://schemas.microsoft.com/office/word/2016/wordml/cid" xmlns:w16="http://schemas.microsoft.com/office/word/2018/wordml" xmlns:w16du="http://schemas.microsoft.com/office/word/2023/wordml/word16du" xmlns:w16sdtdh="http://schemas.microsoft.com/office/word/2020/wordml/sdtdatahash" xmlns:w16sdtfl="http://schemas.microsoft.com/office/word/2024/wordml/sdtformatlock" xmlns:w16se="http://schemas.microsoft.com/office/word/2015/wordml/symex" xmlns:wpg="http://schemas.microsoft.com/office/word/2010/wordprocessingGroup" xmlns:wpi="http://schemas.microsoft.com/office/word/2010/wordprocessingInk" xmlns:wne="http://schemas.microsoft.com/office/word/2006/wordml" xmlns:wps="http://schemas.microsoft.com/office/word/2010/wordprocessingShape" mc:Ignorable="w14 w15 w16se w16cid w16 w16cex w16sdtdh w16sdtfl w16du wp14">
+<w:ftr xmlns:wpc="http://schemas.microsoft.com/office/word/2010/wordprocessingCanvas" xmlns:cx="http://schemas.microsoft.com/office/drawing/2014/chartex" xmlns:cx1="http://schemas.microsoft.com/office/drawing/2015/9/8/chartex" xmlns:cx2="http://schemas.microsoft.com/office/drawing/2015/10/21/chartex" xmlns:cx3="http://schemas.microsoft.com/office/drawing/2016/5/9/chartex" xmlns:cx4="http://schemas.microsoft.com/office/drawing/2016/5/10/chartex" xmlns:cx5="http://schemas.microsoft.com/office/drawing/2016/5/11/chartex" xmlns:cx6="http://schemas.microsoft.com/office/drawing/2016/5/12/chartex" xmlns:cx7="http://schemas.microsoft.com/office/drawing/2016/5/13/chartex" xmlns:cx8="http://schemas.microsoft.com/office/drawing/2016/5/14/chartex" xmlns:mc="http://schemas.openxmlformats.org/markup-compatibility/2006" xmlns:aink="http://schemas.microsoft.com/office/drawing/2016/ink" xmlns:am3d="http://schemas.microsoft.com/office/drawing/2017/model3d" xmlns:o="urn:schemas-microsoft-com:office:office" xmlns:oel="http://schemas.microsoft.com/office/2019/extlst" xmlns:r="http://schemas.openxmlformats.org/officeDocument/2006/relationships" xmlns:m="http://schemas.openxmlformats.org/officeDocument/2006/math" xmlns:v="urn:schemas-microsoft-com:vml" xmlns:wp14="http://schemas.microsoft.com/office/word/2010/wordprocessingDrawing" xmlns:wp="http://schemas.openxmlformats.org/drawingml/2006/wordprocessingDrawing" xmlns:w10="urn:schemas-microsoft-com:office:word" xmlns:w="http://schemas.openxmlformats.org/wordprocessingml/2006/main" xmlns:w14="http://schemas.microsoft.com/office/word/2010/wordml" xmlns:w15="http://schemas.microsoft.com/office/word/2012/wordml" xmlns:w16cex="http://schemas.microsoft.com/office/word/2018/wordml/cex" xmlns:w16cid="http://schemas.microsoft.com/office/word/2016/wordml/cid" xmlns:w16="http://schemas.microsoft.com/office/word/2018/wordml" xmlns:w16du="http://schemas.microsoft.com/office/word/2023/wordml/word16du" xmlns:w16sdtdh="http://schemas.microsoft.com/office/word/2020/wordml/sdtdatahash" xmlns:w16sdtfl="http://schemas.microsoft.com/office/word/2024/wordml/sdtformatlock" xmlns:w16se="http://schemas.microsoft.com/office/word/2015/wordml/symex" xmlns:wpg="http://schemas.microsoft.com/office/word/2010/wordprocessingGroup" xmlns:wpi="http://schemas.microsoft.com/office/word/2010/wordprocessingInk" xmlns:wne="http://schemas.microsoft.com/office/word/2006/wordml" xmlns:wps="http://schemas.microsoft.com/office/word/2010/wordprocessingShape" mc:Ignorable="w14 w15 w16se w16cid w16 w16cex w16sdtdh w16sdtfl w16du wp14">
   <w:p>
     <w:pPr>
       <w:pBdr>
@@ -2441,7 +2473,7 @@
 </file>
 
 <file path=word/footer2.xml><?xml version="1.0" encoding="utf-8"?>
-<w:ftr xmlns:wpc="http://schemas.microsoft.com/office/word/2010/wordprocessingCanvas" xmlns:cx="http://schemas.microsoft.com/office/drawing/2014/chartex" xmlns:cx1="http://schemas.microsoft.com/office/drawing/2015/9/8/chartex" xmlns:cx2="http://schemas.microsoft.com/office/drawing/2015/10/21/chartex" xmlns:cx3="http://schemas.microsoft.com/office/drawing/2016/5/9/chartex" xmlns:cx4="http://schemas.microsoft.com/office/drawing/2016/5/10/chartex" xmlns:cx5="http://schemas.microsoft.com/office/drawing/2016/5/11/chartex" xmlns:cx6="http://schemas.microsoft.com/office/drawing/2016/5/12/chartex" xmlns:cx7="http://schemas.microsoft.com/office/drawing/2016/5/13/chartex" xmlns:cx8="http://schemas.microsoft.com/office/drawing/2016/5/14/chartex" xmlns:mc="http://schemas.openxmlformats.org/markup-compatibility/2006" xmlns:aink="http://schemas.microsoft.com/office/drawing/2016/ink" xmlns:am3d="http://schemas.microsoft.com/office/drawing/2017/model3d" xmlns:o="urn:schemas-microsoft-com:office:office" xmlns:oel="http://schemas.microsoft.com/office/2019/extlst" xmlns:r="http://schemas.openxmlformats.org/officeDocument/2006/relationships" xmlns:m="http://schemas.openxmlformats.org/officeDocument/2006/math" xmlns:v="urn:schemas-microsoft-com:vml" xmlns:wp14="http://schemas.microsoft.com/office/word/2010/wordprocessingDrawing" xmlns:wp="http://schemas.openxmlformats.org/drawingml/2006/wordprocessingDrawing" xmlns:w10="urn:schemas-microsoft-com:office:word" xmlns:w="http://schemas.openxmlformats.org/wordprocessingml/2006/main" xmlns:w14="http://schemas.microsoft.com/office/word/2010/wordml" xmlns:w15="http://schemas.microsoft.com/office/word/2012/wordml" xmlns:w16cei="http://schemas.microsoft.com/office/word/2026/wordml/cei" xmlns:w16cex="http://schemas.microsoft.com/office/word/2018/wordml/cex" xmlns:w16cid="http://schemas.microsoft.com/office/word/2016/wordml/cid" xmlns:w16="http://schemas.microsoft.com/office/word/2018/wordml" xmlns:w16du="http://schemas.microsoft.com/office/word/2023/wordml/word16du" xmlns:w16sdtdh="http://schemas.microsoft.com/office/word/2020/wordml/sdtdatahash" xmlns:w16sdtfl="http://schemas.microsoft.com/office/word/2024/wordml/sdtformatlock" xmlns:w16se="http://schemas.microsoft.com/office/word/2015/wordml/symex" xmlns:wpg="http://schemas.microsoft.com/office/word/2010/wordprocessingGroup" xmlns:wpi="http://schemas.microsoft.com/office/word/2010/wordprocessingInk" xmlns:wne="http://schemas.microsoft.com/office/word/2006/wordml" xmlns:wps="http://schemas.microsoft.com/office/word/2010/wordprocessingShape" mc:Ignorable="w14 w15 w16se w16cid w16 w16cex w16sdtdh w16sdtfl w16du wp14">
+<w:ftr xmlns:wpc="http://schemas.microsoft.com/office/word/2010/wordprocessingCanvas" xmlns:cx="http://schemas.microsoft.com/office/drawing/2014/chartex" xmlns:cx1="http://schemas.microsoft.com/office/drawing/2015/9/8/chartex" xmlns:cx2="http://schemas.microsoft.com/office/drawing/2015/10/21/chartex" xmlns:cx3="http://schemas.microsoft.com/office/drawing/2016/5/9/chartex" xmlns:cx4="http://schemas.microsoft.com/office/drawing/2016/5/10/chartex" xmlns:cx5="http://schemas.microsoft.com/office/drawing/2016/5/11/chartex" xmlns:cx6="http://schemas.microsoft.com/office/drawing/2016/5/12/chartex" xmlns:cx7="http://schemas.microsoft.com/office/drawing/2016/5/13/chartex" xmlns:cx8="http://schemas.microsoft.com/office/drawing/2016/5/14/chartex" xmlns:mc="http://schemas.openxmlformats.org/markup-compatibility/2006" xmlns:aink="http://schemas.microsoft.com/office/drawing/2016/ink" xmlns:am3d="http://schemas.microsoft.com/office/drawing/2017/model3d" xmlns:o="urn:schemas-microsoft-com:office:office" xmlns:oel="http://schemas.microsoft.com/office/2019/extlst" xmlns:r="http://schemas.openxmlformats.org/officeDocument/2006/relationships" xmlns:m="http://schemas.openxmlformats.org/officeDocument/2006/math" xmlns:v="urn:schemas-microsoft-com:vml" xmlns:wp14="http://schemas.microsoft.com/office/word/2010/wordprocessingDrawing" xmlns:wp="http://schemas.openxmlformats.org/drawingml/2006/wordprocessingDrawing" xmlns:w10="urn:schemas-microsoft-com:office:word" xmlns:w="http://schemas.openxmlformats.org/wordprocessingml/2006/main" xmlns:w14="http://schemas.microsoft.com/office/word/2010/wordml" xmlns:w15="http://schemas.microsoft.com/office/word/2012/wordml" xmlns:w16cex="http://schemas.microsoft.com/office/word/2018/wordml/cex" xmlns:w16cid="http://schemas.microsoft.com/office/word/2016/wordml/cid" xmlns:w16="http://schemas.microsoft.com/office/word/2018/wordml" xmlns:w16du="http://schemas.microsoft.com/office/word/2023/wordml/word16du" xmlns:w16sdtdh="http://schemas.microsoft.com/office/word/2020/wordml/sdtdatahash" xmlns:w16sdtfl="http://schemas.microsoft.com/office/word/2024/wordml/sdtformatlock" xmlns:w16se="http://schemas.microsoft.com/office/word/2015/wordml/symex" xmlns:wpg="http://schemas.microsoft.com/office/word/2010/wordprocessingGroup" xmlns:wpi="http://schemas.microsoft.com/office/word/2010/wordprocessingInk" xmlns:wne="http://schemas.microsoft.com/office/word/2006/wordml" xmlns:wps="http://schemas.microsoft.com/office/word/2010/wordprocessingShape" mc:Ignorable="w14 w15 w16se w16cid w16 w16cex w16sdtdh w16sdtfl w16du wp14">
   <w:p>
     <w:pPr>
       <w:pBdr>
@@ -2547,7 +2579,7 @@
 </file>
 
 <file path=word/footer3.xml><?xml version="1.0" encoding="utf-8"?>
-<w:ftr xmlns:wpc="http://schemas.microsoft.com/office/word/2010/wordprocessingCanvas" xmlns:cx="http://schemas.microsoft.com/office/drawing/2014/chartex" xmlns:cx1="http://schemas.microsoft.com/office/drawing/2015/9/8/chartex" xmlns:cx2="http://schemas.microsoft.com/office/drawing/2015/10/21/chartex" xmlns:cx3="http://schemas.microsoft.com/office/drawing/2016/5/9/chartex" xmlns:cx4="http://schemas.microsoft.com/office/drawing/2016/5/10/chartex" xmlns:cx5="http://schemas.microsoft.com/office/drawing/2016/5/11/chartex" xmlns:cx6="http://schemas.microsoft.com/office/drawing/2016/5/12/chartex" xmlns:cx7="http://schemas.microsoft.com/office/drawing/2016/5/13/chartex" xmlns:cx8="http://schemas.microsoft.com/office/drawing/2016/5/14/chartex" xmlns:mc="http://schemas.openxmlformats.org/markup-compatibility/2006" xmlns:aink="http://schemas.microsoft.com/office/drawing/2016/ink" xmlns:am3d="http://schemas.microsoft.com/office/drawing/2017/model3d" xmlns:o="urn:schemas-microsoft-com:office:office" xmlns:oel="http://schemas.microsoft.com/office/2019/extlst" xmlns:r="http://schemas.openxmlformats.org/officeDocument/2006/relationships" xmlns:m="http://schemas.openxmlformats.org/officeDocument/2006/math" xmlns:v="urn:schemas-microsoft-com:vml" xmlns:wp14="http://schemas.microsoft.com/office/word/2010/wordprocessingDrawing" xmlns:wp="http://schemas.openxmlformats.org/drawingml/2006/wordprocessingDrawing" xmlns:w10="urn:schemas-microsoft-com:office:word" xmlns:w="http://schemas.openxmlformats.org/wordprocessingml/2006/main" xmlns:w14="http://schemas.microsoft.com/office/word/2010/wordml" xmlns:w15="http://schemas.microsoft.com/office/word/2012/wordml" xmlns:w16cei="http://schemas.microsoft.com/office/word/2026/wordml/cei" xmlns:w16cex="http://schemas.microsoft.com/office/word/2018/wordml/cex" xmlns:w16cid="http://schemas.microsoft.com/office/word/2016/wordml/cid" xmlns:w16="http://schemas.microsoft.com/office/word/2018/wordml" xmlns:w16du="http://schemas.microsoft.com/office/word/2023/wordml/word16du" xmlns:w16sdtdh="http://schemas.microsoft.com/office/word/2020/wordml/sdtdatahash" xmlns:w16sdtfl="http://schemas.microsoft.com/office/word/2024/wordml/sdtformatlock" xmlns:w16se="http://schemas.microsoft.com/office/word/2015/wordml/symex" xmlns:wpg="http://schemas.microsoft.com/office/word/2010/wordprocessingGroup" xmlns:wpi="http://schemas.microsoft.com/office/word/2010/wordprocessingInk" xmlns:wne="http://schemas.microsoft.com/office/word/2006/wordml" xmlns:wps="http://schemas.microsoft.com/office/word/2010/wordprocessingShape" mc:Ignorable="w14 w15 w16se w16cid w16 w16cex w16sdtdh w16sdtfl w16du wp14">
+<w:ftr xmlns:wpc="http://schemas.microsoft.com/office/word/2010/wordprocessingCanvas" xmlns:cx="http://schemas.microsoft.com/office/drawing/2014/chartex" xmlns:cx1="http://schemas.microsoft.com/office/drawing/2015/9/8/chartex" xmlns:cx2="http://schemas.microsoft.com/office/drawing/2015/10/21/chartex" xmlns:cx3="http://schemas.microsoft.com/office/drawing/2016/5/9/chartex" xmlns:cx4="http://schemas.microsoft.com/office/drawing/2016/5/10/chartex" xmlns:cx5="http://schemas.microsoft.com/office/drawing/2016/5/11/chartex" xmlns:cx6="http://schemas.microsoft.com/office/drawing/2016/5/12/chartex" xmlns:cx7="http://schemas.microsoft.com/office/drawing/2016/5/13/chartex" xmlns:cx8="http://schemas.microsoft.com/office/drawing/2016/5/14/chartex" xmlns:mc="http://schemas.openxmlformats.org/markup-compatibility/2006" xmlns:aink="http://schemas.microsoft.com/office/drawing/2016/ink" xmlns:am3d="http://schemas.microsoft.com/office/drawing/2017/model3d" xmlns:o="urn:schemas-microsoft-com:office:office" xmlns:oel="http://schemas.microsoft.com/office/2019/extlst" xmlns:r="http://schemas.openxmlformats.org/officeDocument/2006/relationships" xmlns:m="http://schemas.openxmlformats.org/officeDocument/2006/math" xmlns:v="urn:schemas-microsoft-com:vml" xmlns:wp14="http://schemas.microsoft.com/office/word/2010/wordprocessingDrawing" xmlns:wp="http://schemas.openxmlformats.org/drawingml/2006/wordprocessingDrawing" xmlns:w10="urn:schemas-microsoft-com:office:word" xmlns:w="http://schemas.openxmlformats.org/wordprocessingml/2006/main" xmlns:w14="http://schemas.microsoft.com/office/word/2010/wordml" xmlns:w15="http://schemas.microsoft.com/office/word/2012/wordml" xmlns:w16cex="http://schemas.microsoft.com/office/word/2018/wordml/cex" xmlns:w16cid="http://schemas.microsoft.com/office/word/2016/wordml/cid" xmlns:w16="http://schemas.microsoft.com/office/word/2018/wordml" xmlns:w16du="http://schemas.microsoft.com/office/word/2023/wordml/word16du" xmlns:w16sdtdh="http://schemas.microsoft.com/office/word/2020/wordml/sdtdatahash" xmlns:w16sdtfl="http://schemas.microsoft.com/office/word/2024/wordml/sdtformatlock" xmlns:w16se="http://schemas.microsoft.com/office/word/2015/wordml/symex" xmlns:wpg="http://schemas.microsoft.com/office/word/2010/wordprocessingGroup" xmlns:wpi="http://schemas.microsoft.com/office/word/2010/wordprocessingInk" xmlns:wne="http://schemas.microsoft.com/office/word/2006/wordml" xmlns:wps="http://schemas.microsoft.com/office/word/2010/wordprocessingShape" mc:Ignorable="w14 w15 w16se w16cid w16 w16cex w16sdtdh w16sdtfl w16du wp14">
   <w:p>
     <w:pPr>
       <w:pBdr>
@@ -2572,7 +2604,7 @@
 </file>
 
 <file path=word/footnotes.xml><?xml version="1.0" encoding="utf-8"?>
-<w:footnotes xmlns:wpc="http://schemas.microsoft.com/office/word/2010/wordprocessingCanvas" xmlns:cx="http://schemas.microsoft.com/office/drawing/2014/chartex" xmlns:cx1="http://schemas.microsoft.com/office/drawing/2015/9/8/chartex" xmlns:cx2="http://schemas.microsoft.com/office/drawing/2015/10/21/chartex" xmlns:cx3="http://schemas.microsoft.com/office/drawing/2016/5/9/chartex" xmlns:cx4="http://schemas.microsoft.com/office/drawing/2016/5/10/chartex" xmlns:cx5="http://schemas.microsoft.com/office/drawing/2016/5/11/chartex" xmlns:cx6="http://schemas.microsoft.com/office/drawing/2016/5/12/chartex" xmlns:cx7="http://schemas.microsoft.com/office/drawing/2016/5/13/chartex" xmlns:cx8="http://schemas.microsoft.com/office/drawing/2016/5/14/chartex" xmlns:mc="http://schemas.openxmlformats.org/markup-compatibility/2006" xmlns:aink="http://schemas.microsoft.com/office/drawing/2016/ink" xmlns:am3d="http://schemas.microsoft.com/office/drawing/2017/model3d" xmlns:o="urn:schemas-microsoft-com:office:office" xmlns:oel="http://schemas.microsoft.com/office/2019/extlst" xmlns:r="http://schemas.openxmlformats.org/officeDocument/2006/relationships" xmlns:m="http://schemas.openxmlformats.org/officeDocument/2006/math" xmlns:v="urn:schemas-microsoft-com:vml" xmlns:wp14="http://schemas.microsoft.com/office/word/2010/wordprocessingDrawing" xmlns:wp="http://schemas.openxmlformats.org/drawingml/2006/wordprocessingDrawing" xmlns:w10="urn:schemas-microsoft-com:office:word" xmlns:w="http://schemas.openxmlformats.org/wordprocessingml/2006/main" xmlns:w14="http://schemas.microsoft.com/office/word/2010/wordml" xmlns:w15="http://schemas.microsoft.com/office/word/2012/wordml" xmlns:w16cei="http://schemas.microsoft.com/office/word/2026/wordml/cei" xmlns:w16cex="http://schemas.microsoft.com/office/word/2018/wordml/cex" xmlns:w16cid="http://schemas.microsoft.com/office/word/2016/wordml/cid" xmlns:w16="http://schemas.microsoft.com/office/word/2018/wordml" xmlns:w16du="http://schemas.microsoft.com/office/word/2023/wordml/word16du" xmlns:w16sdtdh="http://schemas.microsoft.com/office/word/2020/wordml/sdtdatahash" xmlns:w16sdtfl="http://schemas.microsoft.com/office/word/2024/wordml/sdtformatlock" xmlns:w16se="http://schemas.microsoft.com/office/word/2015/wordml/symex" xmlns:wpg="http://schemas.microsoft.com/office/word/2010/wordprocessingGroup" xmlns:wpi="http://schemas.microsoft.com/office/word/2010/wordprocessingInk" xmlns:wne="http://schemas.microsoft.com/office/word/2006/wordml" xmlns:wps="http://schemas.microsoft.com/office/word/2010/wordprocessingShape" mc:Ignorable="w14 w15 w16se w16cid w16 w16cex w16sdtdh w16sdtfl w16du wp14">
+<w:footnotes xmlns:wpc="http://schemas.microsoft.com/office/word/2010/wordprocessingCanvas" xmlns:cx="http://schemas.microsoft.com/office/drawing/2014/chartex" xmlns:cx1="http://schemas.microsoft.com/office/drawing/2015/9/8/chartex" xmlns:cx2="http://schemas.microsoft.com/office/drawing/2015/10/21/chartex" xmlns:cx3="http://schemas.microsoft.com/office/drawing/2016/5/9/chartex" xmlns:cx4="http://schemas.microsoft.com/office/drawing/2016/5/10/chartex" xmlns:cx5="http://schemas.microsoft.com/office/drawing/2016/5/11/chartex" xmlns:cx6="http://schemas.microsoft.com/office/drawing/2016/5/12/chartex" xmlns:cx7="http://schemas.microsoft.com/office/drawing/2016/5/13/chartex" xmlns:cx8="http://schemas.microsoft.com/office/drawing/2016/5/14/chartex" xmlns:mc="http://schemas.openxmlformats.org/markup-compatibility/2006" xmlns:aink="http://schemas.microsoft.com/office/drawing/2016/ink" xmlns:am3d="http://schemas.microsoft.com/office/drawing/2017/model3d" xmlns:o="urn:schemas-microsoft-com:office:office" xmlns:oel="http://schemas.microsoft.com/office/2019/extlst" xmlns:r="http://schemas.openxmlformats.org/officeDocument/2006/relationships" xmlns:m="http://schemas.openxmlformats.org/officeDocument/2006/math" xmlns:v="urn:schemas-microsoft-com:vml" xmlns:wp14="http://schemas.microsoft.com/office/word/2010/wordprocessingDrawing" xmlns:wp="http://schemas.openxmlformats.org/drawingml/2006/wordprocessingDrawing" xmlns:w10="urn:schemas-microsoft-com:office:word" xmlns:w="http://schemas.openxmlformats.org/wordprocessingml/2006/main" xmlns:w14="http://schemas.microsoft.com/office/word/2010/wordml" xmlns:w15="http://schemas.microsoft.com/office/word/2012/wordml" xmlns:w16cex="http://schemas.microsoft.com/office/word/2018/wordml/cex" xmlns:w16cid="http://schemas.microsoft.com/office/word/2016/wordml/cid" xmlns:w16="http://schemas.microsoft.com/office/word/2018/wordml" xmlns:w16du="http://schemas.microsoft.com/office/word/2023/wordml/word16du" xmlns:w16sdtdh="http://schemas.microsoft.com/office/word/2020/wordml/sdtdatahash" xmlns:w16sdtfl="http://schemas.microsoft.com/office/word/2024/wordml/sdtformatlock" xmlns:w16se="http://schemas.microsoft.com/office/word/2015/wordml/symex" xmlns:wpg="http://schemas.microsoft.com/office/word/2010/wordprocessingGroup" xmlns:wpi="http://schemas.microsoft.com/office/word/2010/wordprocessingInk" xmlns:wne="http://schemas.microsoft.com/office/word/2006/wordml" xmlns:wps="http://schemas.microsoft.com/office/word/2010/wordprocessingShape" mc:Ignorable="w14 w15 w16se w16cid w16 w16cex w16sdtdh w16sdtfl w16du wp14">
   <w:footnote w:type="separator" w:id="-1">
     <w:p>
       <w:pPr>
@@ -2597,7 +2629,7 @@
 </file>
 
 <file path=word/header1.xml><?xml version="1.0" encoding="utf-8"?>
-<w:hdr xmlns:wpc="http://schemas.microsoft.com/office/word/2010/wordprocessingCanvas" xmlns:cx="http://schemas.microsoft.com/office/drawing/2014/chartex" xmlns:cx1="http://schemas.microsoft.com/office/drawing/2015/9/8/chartex" xmlns:cx2="http://schemas.microsoft.com/office/drawing/2015/10/21/chartex" xmlns:cx3="http://schemas.microsoft.com/office/drawing/2016/5/9/chartex" xmlns:cx4="http://schemas.microsoft.com/office/drawing/2016/5/10/chartex" xmlns:cx5="http://schemas.microsoft.com/office/drawing/2016/5/11/chartex" xmlns:cx6="http://schemas.microsoft.com/office/drawing/2016/5/12/chartex" xmlns:cx7="http://schemas.microsoft.com/office/drawing/2016/5/13/chartex" xmlns:cx8="http://schemas.microsoft.com/office/drawing/2016/5/14/chartex" xmlns:mc="http://schemas.openxmlformats.org/markup-compatibility/2006" xmlns:aink="http://schemas.microsoft.com/office/drawing/2016/ink" xmlns:am3d="http://schemas.microsoft.com/office/drawing/2017/model3d" xmlns:o="urn:schemas-microsoft-com:office:office" xmlns:oel="http://schemas.microsoft.com/office/2019/extlst" xmlns:r="http://schemas.openxmlformats.org/officeDocument/2006/relationships" xmlns:m="http://schemas.openxmlformats.org/officeDocument/2006/math" xmlns:v="urn:schemas-microsoft-com:vml" xmlns:wp14="http://schemas.microsoft.com/office/word/2010/wordprocessingDrawing" xmlns:wp="http://schemas.openxmlformats.org/drawingml/2006/wordprocessingDrawing" xmlns:w10="urn:schemas-microsoft-com:office:word" xmlns:w="http://schemas.openxmlformats.org/wordprocessingml/2006/main" xmlns:w14="http://schemas.microsoft.com/office/word/2010/wordml" xmlns:w15="http://schemas.microsoft.com/office/word/2012/wordml" xmlns:w16cei="http://schemas.microsoft.com/office/word/2026/wordml/cei" xmlns:w16cex="http://schemas.microsoft.com/office/word/2018/wordml/cex" xmlns:w16cid="http://schemas.microsoft.com/office/word/2016/wordml/cid" xmlns:w16="http://schemas.microsoft.com/office/word/2018/wordml" xmlns:w16du="http://schemas.microsoft.com/office/word/2023/wordml/word16du" xmlns:w16sdtdh="http://schemas.microsoft.com/office/word/2020/wordml/sdtdatahash" xmlns:w16sdtfl="http://schemas.microsoft.com/office/word/2024/wordml/sdtformatlock" xmlns:w16se="http://schemas.microsoft.com/office/word/2015/wordml/symex" xmlns:wpg="http://schemas.microsoft.com/office/word/2010/wordprocessingGroup" xmlns:wpi="http://schemas.microsoft.com/office/word/2010/wordprocessingInk" xmlns:wne="http://schemas.microsoft.com/office/word/2006/wordml" xmlns:wps="http://schemas.microsoft.com/office/word/2010/wordprocessingShape" mc:Ignorable="w14 w15 w16se w16cid w16 w16cex w16sdtdh w16sdtfl w16du wp14">
+<w:hdr xmlns:wpc="http://schemas.microsoft.com/office/word/2010/wordprocessingCanvas" xmlns:cx="http://schemas.microsoft.com/office/drawing/2014/chartex" xmlns:cx1="http://schemas.microsoft.com/office/drawing/2015/9/8/chartex" xmlns:cx2="http://schemas.microsoft.com/office/drawing/2015/10/21/chartex" xmlns:cx3="http://schemas.microsoft.com/office/drawing/2016/5/9/chartex" xmlns:cx4="http://schemas.microsoft.com/office/drawing/2016/5/10/chartex" xmlns:cx5="http://schemas.microsoft.com/office/drawing/2016/5/11/chartex" xmlns:cx6="http://schemas.microsoft.com/office/drawing/2016/5/12/chartex" xmlns:cx7="http://schemas.microsoft.com/office/drawing/2016/5/13/chartex" xmlns:cx8="http://schemas.microsoft.com/office/drawing/2016/5/14/chartex" xmlns:mc="http://schemas.openxmlformats.org/markup-compatibility/2006" xmlns:aink="http://schemas.microsoft.com/office/drawing/2016/ink" xmlns:am3d="http://schemas.microsoft.com/office/drawing/2017/model3d" xmlns:o="urn:schemas-microsoft-com:office:office" xmlns:oel="http://schemas.microsoft.com/office/2019/extlst" xmlns:r="http://schemas.openxmlformats.org/officeDocument/2006/relationships" xmlns:m="http://schemas.openxmlformats.org/officeDocument/2006/math" xmlns:v="urn:schemas-microsoft-com:vml" xmlns:wp14="http://schemas.microsoft.com/office/word/2010/wordprocessingDrawing" xmlns:wp="http://schemas.openxmlformats.org/drawingml/2006/wordprocessingDrawing" xmlns:w10="urn:schemas-microsoft-com:office:word" xmlns:w="http://schemas.openxmlformats.org/wordprocessingml/2006/main" xmlns:w14="http://schemas.microsoft.com/office/word/2010/wordml" xmlns:w15="http://schemas.microsoft.com/office/word/2012/wordml" xmlns:w16cex="http://schemas.microsoft.com/office/word/2018/wordml/cex" xmlns:w16cid="http://schemas.microsoft.com/office/word/2016/wordml/cid" xmlns:w16="http://schemas.microsoft.com/office/word/2018/wordml" xmlns:w16du="http://schemas.microsoft.com/office/word/2023/wordml/word16du" xmlns:w16sdtdh="http://schemas.microsoft.com/office/word/2020/wordml/sdtdatahash" xmlns:w16sdtfl="http://schemas.microsoft.com/office/word/2024/wordml/sdtformatlock" xmlns:w16se="http://schemas.microsoft.com/office/word/2015/wordml/symex" xmlns:wpg="http://schemas.microsoft.com/office/word/2010/wordprocessingGroup" xmlns:wpi="http://schemas.microsoft.com/office/word/2010/wordprocessingInk" xmlns:wne="http://schemas.microsoft.com/office/word/2006/wordml" xmlns:wps="http://schemas.microsoft.com/office/word/2010/wordprocessingShape" mc:Ignorable="w14 w15 w16se w16cid w16 w16cex w16sdtdh w16sdtfl w16du wp14">
   <w:p>
     <w:pPr>
       <w:pBdr>
@@ -2622,7 +2654,7 @@
 </file>
 
 <file path=word/header2.xml><?xml version="1.0" encoding="utf-8"?>
-<w:hdr xmlns:wpc="http://schemas.microsoft.com/office/word/2010/wordprocessingCanvas" xmlns:cx="http://schemas.microsoft.com/office/drawing/2014/chartex" xmlns:cx1="http://schemas.microsoft.com/office/drawing/2015/9/8/chartex" xmlns:cx2="http://schemas.microsoft.com/office/drawing/2015/10/21/chartex" xmlns:cx3="http://schemas.microsoft.com/office/drawing/2016/5/9/chartex" xmlns:cx4="http://schemas.microsoft.com/office/drawing/2016/5/10/chartex" xmlns:cx5="http://schemas.microsoft.com/office/drawing/2016/5/11/chartex" xmlns:cx6="http://schemas.microsoft.com/office/drawing/2016/5/12/chartex" xmlns:cx7="http://schemas.microsoft.com/office/drawing/2016/5/13/chartex" xmlns:cx8="http://schemas.microsoft.com/office/drawing/2016/5/14/chartex" xmlns:mc="http://schemas.openxmlformats.org/markup-compatibility/2006" xmlns:aink="http://schemas.microsoft.com/office/drawing/2016/ink" xmlns:am3d="http://schemas.microsoft.com/office/drawing/2017/model3d" xmlns:o="urn:schemas-microsoft-com:office:office" xmlns:oel="http://schemas.microsoft.com/office/2019/extlst" xmlns:r="http://schemas.openxmlformats.org/officeDocument/2006/relationships" xmlns:m="http://schemas.openxmlformats.org/officeDocument/2006/math" xmlns:v="urn:schemas-microsoft-com:vml" xmlns:wp14="http://schemas.microsoft.com/office/word/2010/wordprocessingDrawing" xmlns:wp="http://schemas.openxmlformats.org/drawingml/2006/wordprocessingDrawing" xmlns:w10="urn:schemas-microsoft-com:office:word" xmlns:w="http://schemas.openxmlformats.org/wordprocessingml/2006/main" xmlns:w14="http://schemas.microsoft.com/office/word/2010/wordml" xmlns:w15="http://schemas.microsoft.com/office/word/2012/wordml" xmlns:w16cei="http://schemas.microsoft.com/office/word/2026/wordml/cei" xmlns:w16cex="http://schemas.microsoft.com/office/word/2018/wordml/cex" xmlns:w16cid="http://schemas.microsoft.com/office/word/2016/wordml/cid" xmlns:w16="http://schemas.microsoft.com/office/word/2018/wordml" xmlns:w16du="http://schemas.microsoft.com/office/word/2023/wordml/word16du" xmlns:w16sdtdh="http://schemas.microsoft.com/office/word/2020/wordml/sdtdatahash" xmlns:w16sdtfl="http://schemas.microsoft.com/office/word/2024/wordml/sdtformatlock" xmlns:w16se="http://schemas.microsoft.com/office/word/2015/wordml/symex" xmlns:wpg="http://schemas.microsoft.com/office/word/2010/wordprocessingGroup" xmlns:wpi="http://schemas.microsoft.com/office/word/2010/wordprocessingInk" xmlns:wne="http://schemas.microsoft.com/office/word/2006/wordml" xmlns:wps="http://schemas.microsoft.com/office/word/2010/wordprocessingShape" mc:Ignorable="w14 w15 w16se w16cid w16 w16cex w16sdtdh w16sdtfl w16du wp14">
+<w:hdr xmlns:wpc="http://schemas.microsoft.com/office/word/2010/wordprocessingCanvas" xmlns:cx="http://schemas.microsoft.com/office/drawing/2014/chartex" xmlns:cx1="http://schemas.microsoft.com/office/drawing/2015/9/8/chartex" xmlns:cx2="http://schemas.microsoft.com/office/drawing/2015/10/21/chartex" xmlns:cx3="http://schemas.microsoft.com/office/drawing/2016/5/9/chartex" xmlns:cx4="http://schemas.microsoft.com/office/drawing/2016/5/10/chartex" xmlns:cx5="http://schemas.microsoft.com/office/drawing/2016/5/11/chartex" xmlns:cx6="http://schemas.microsoft.com/office/drawing/2016/5/12/chartex" xmlns:cx7="http://schemas.microsoft.com/office/drawing/2016/5/13/chartex" xmlns:cx8="http://schemas.microsoft.com/office/drawing/2016/5/14/chartex" xmlns:mc="http://schemas.openxmlformats.org/markup-compatibility/2006" xmlns:aink="http://schemas.microsoft.com/office/drawing/2016/ink" xmlns:am3d="http://schemas.microsoft.com/office/drawing/2017/model3d" xmlns:o="urn:schemas-microsoft-com:office:office" xmlns:oel="http://schemas.microsoft.com/office/2019/extlst" xmlns:r="http://schemas.openxmlformats.org/officeDocument/2006/relationships" xmlns:m="http://schemas.openxmlformats.org/officeDocument/2006/math" xmlns:v="urn:schemas-microsoft-com:vml" xmlns:wp14="http://schemas.microsoft.com/office/word/2010/wordprocessingDrawing" xmlns:wp="http://schemas.openxmlformats.org/drawingml/2006/wordprocessingDrawing" xmlns:w10="urn:schemas-microsoft-com:office:word" xmlns:w="http://schemas.openxmlformats.org/wordprocessingml/2006/main" xmlns:w14="http://schemas.microsoft.com/office/word/2010/wordml" xmlns:w15="http://schemas.microsoft.com/office/word/2012/wordml" xmlns:w16cex="http://schemas.microsoft.com/office/word/2018/wordml/cex" xmlns:w16cid="http://schemas.microsoft.com/office/word/2016/wordml/cid" xmlns:w16="http://schemas.microsoft.com/office/word/2018/wordml" xmlns:w16du="http://schemas.microsoft.com/office/word/2023/wordml/word16du" xmlns:w16sdtdh="http://schemas.microsoft.com/office/word/2020/wordml/sdtdatahash" xmlns:w16sdtfl="http://schemas.microsoft.com/office/word/2024/wordml/sdtformatlock" xmlns:w16se="http://schemas.microsoft.com/office/word/2015/wordml/symex" xmlns:wpg="http://schemas.microsoft.com/office/word/2010/wordprocessingGroup" xmlns:wpi="http://schemas.microsoft.com/office/word/2010/wordprocessingInk" xmlns:wne="http://schemas.microsoft.com/office/word/2006/wordml" xmlns:wps="http://schemas.microsoft.com/office/word/2010/wordprocessingShape" mc:Ignorable="w14 w15 w16se w16cid w16 w16cex w16sdtdh w16sdtfl w16du wp14">
   <w:p>
     <w:pPr>
       <w:pBdr>
@@ -2647,7 +2679,7 @@
 </file>
 
 <file path=word/header3.xml><?xml version="1.0" encoding="utf-8"?>
-<w:hdr xmlns:wpc="http://schemas.microsoft.com/office/word/2010/wordprocessingCanvas" xmlns:cx="http://schemas.microsoft.com/office/drawing/2014/chartex" xmlns:cx1="http://schemas.microsoft.com/office/drawing/2015/9/8/chartex" xmlns:cx2="http://schemas.microsoft.com/office/drawing/2015/10/21/chartex" xmlns:cx3="http://schemas.microsoft.com/office/drawing/2016/5/9/chartex" xmlns:cx4="http://schemas.microsoft.com/office/drawing/2016/5/10/chartex" xmlns:cx5="http://schemas.microsoft.com/office/drawing/2016/5/11/chartex" xmlns:cx6="http://schemas.microsoft.com/office/drawing/2016/5/12/chartex" xmlns:cx7="http://schemas.microsoft.com/office/drawing/2016/5/13/chartex" xmlns:cx8="http://schemas.microsoft.com/office/drawing/2016/5/14/chartex" xmlns:mc="http://schemas.openxmlformats.org/markup-compatibility/2006" xmlns:aink="http://schemas.microsoft.com/office/drawing/2016/ink" xmlns:am3d="http://schemas.microsoft.com/office/drawing/2017/model3d" xmlns:o="urn:schemas-microsoft-com:office:office" xmlns:oel="http://schemas.microsoft.com/office/2019/extlst" xmlns:r="http://schemas.openxmlformats.org/officeDocument/2006/relationships" xmlns:m="http://schemas.openxmlformats.org/officeDocument/2006/math" xmlns:v="urn:schemas-microsoft-com:vml" xmlns:wp14="http://schemas.microsoft.com/office/word/2010/wordprocessingDrawing" xmlns:wp="http://schemas.openxmlformats.org/drawingml/2006/wordprocessingDrawing" xmlns:w10="urn:schemas-microsoft-com:office:word" xmlns:w="http://schemas.openxmlformats.org/wordprocessingml/2006/main" xmlns:w14="http://schemas.microsoft.com/office/word/2010/wordml" xmlns:w15="http://schemas.microsoft.com/office/word/2012/wordml" xmlns:w16cei="http://schemas.microsoft.com/office/word/2026/wordml/cei" xmlns:w16cex="http://schemas.microsoft.com/office/word/2018/wordml/cex" xmlns:w16cid="http://schemas.microsoft.com/office/word/2016/wordml/cid" xmlns:w16="http://schemas.microsoft.com/office/word/2018/wordml" xmlns:w16du="http://schemas.microsoft.com/office/word/2023/wordml/word16du" xmlns:w16sdtdh="http://schemas.microsoft.com/office/word/2020/wordml/sdtdatahash" xmlns:w16sdtfl="http://schemas.microsoft.com/office/word/2024/wordml/sdtformatlock" xmlns:w16se="http://schemas.microsoft.com/office/word/2015/wordml/symex" xmlns:wpg="http://schemas.microsoft.com/office/word/2010/wordprocessingGroup" xmlns:wpi="http://schemas.microsoft.com/office/word/2010/wordprocessingInk" xmlns:wne="http://schemas.microsoft.com/office/word/2006/wordml" xmlns:wps="http://schemas.microsoft.com/office/word/2010/wordprocessingShape" mc:Ignorable="w14 w15 w16se w16cid w16 w16cex w16sdtdh w16sdtfl w16du wp14">
+<w:hdr xmlns:wpc="http://schemas.microsoft.com/office/word/2010/wordprocessingCanvas" xmlns:cx="http://schemas.microsoft.com/office/drawing/2014/chartex" xmlns:cx1="http://schemas.microsoft.com/office/drawing/2015/9/8/chartex" xmlns:cx2="http://schemas.microsoft.com/office/drawing/2015/10/21/chartex" xmlns:cx3="http://schemas.microsoft.com/office/drawing/2016/5/9/chartex" xmlns:cx4="http://schemas.microsoft.com/office/drawing/2016/5/10/chartex" xmlns:cx5="http://schemas.microsoft.com/office/drawing/2016/5/11/chartex" xmlns:cx6="http://schemas.microsoft.com/office/drawing/2016/5/12/chartex" xmlns:cx7="http://schemas.microsoft.com/office/drawing/2016/5/13/chartex" xmlns:cx8="http://schemas.microsoft.com/office/drawing/2016/5/14/chartex" xmlns:mc="http://schemas.openxmlformats.org/markup-compatibility/2006" xmlns:aink="http://schemas.microsoft.com/office/drawing/2016/ink" xmlns:am3d="http://schemas.microsoft.com/office/drawing/2017/model3d" xmlns:o="urn:schemas-microsoft-com:office:office" xmlns:oel="http://schemas.microsoft.com/office/2019/extlst" xmlns:r="http://schemas.openxmlformats.org/officeDocument/2006/relationships" xmlns:m="http://schemas.openxmlformats.org/officeDocument/2006/math" xmlns:v="urn:schemas-microsoft-com:vml" xmlns:wp14="http://schemas.microsoft.com/office/word/2010/wordprocessingDrawing" xmlns:wp="http://schemas.openxmlformats.org/drawingml/2006/wordprocessingDrawing" xmlns:w10="urn:schemas-microsoft-com:office:word" xmlns:w="http://schemas.openxmlformats.org/wordprocessingml/2006/main" xmlns:w14="http://schemas.microsoft.com/office/word/2010/wordml" xmlns:w15="http://schemas.microsoft.com/office/word/2012/wordml" xmlns:w16cex="http://schemas.microsoft.com/office/word/2018/wordml/cex" xmlns:w16cid="http://schemas.microsoft.com/office/word/2016/wordml/cid" xmlns:w16="http://schemas.microsoft.com/office/word/2018/wordml" xmlns:w16du="http://schemas.microsoft.com/office/word/2023/wordml/word16du" xmlns:w16sdtdh="http://schemas.microsoft.com/office/word/2020/wordml/sdtdatahash" xmlns:w16sdtfl="http://schemas.microsoft.com/office/word/2024/wordml/sdtformatlock" xmlns:w16se="http://schemas.microsoft.com/office/word/2015/wordml/symex" xmlns:wpg="http://schemas.microsoft.com/office/word/2010/wordprocessingGroup" xmlns:wpi="http://schemas.microsoft.com/office/word/2010/wordprocessingInk" xmlns:wne="http://schemas.microsoft.com/office/word/2006/wordml" xmlns:wps="http://schemas.microsoft.com/office/word/2010/wordprocessingShape" mc:Ignorable="w14 w15 w16se w16cid w16 w16cex w16sdtdh w16sdtfl w16du wp14">
   <w:p>
     <w:pPr>
       <w:pBdr>
@@ -2672,7 +2704,7 @@
 </file>
 
 <file path=word/numbering.xml><?xml version="1.0" encoding="utf-8"?>
-<w:numbering xmlns:wpc="http://schemas.microsoft.com/office/word/2010/wordprocessingCanvas" xmlns:cx="http://schemas.microsoft.com/office/drawing/2014/chartex" xmlns:cx1="http://schemas.microsoft.com/office/drawing/2015/9/8/chartex" xmlns:cx2="http://schemas.microsoft.com/office/drawing/2015/10/21/chartex" xmlns:cx3="http://schemas.microsoft.com/office/drawing/2016/5/9/chartex" xmlns:cx4="http://schemas.microsoft.com/office/drawing/2016/5/10/chartex" xmlns:cx5="http://schemas.microsoft.com/office/drawing/2016/5/11/chartex" xmlns:cx6="http://schemas.microsoft.com/office/drawing/2016/5/12/chartex" xmlns:cx7="http://schemas.microsoft.com/office/drawing/2016/5/13/chartex" xmlns:cx8="http://schemas.microsoft.com/office/drawing/2016/5/14/chartex" xmlns:mc="http://schemas.openxmlformats.org/markup-compatibility/2006" xmlns:aink="http://schemas.microsoft.com/office/drawing/2016/ink" xmlns:am3d="http://schemas.microsoft.com/office/drawing/2017/model3d" xmlns:o="urn:schemas-microsoft-com:office:office" xmlns:oel="http://schemas.microsoft.com/office/2019/extlst" xmlns:r="http://schemas.openxmlformats.org/officeDocument/2006/relationships" xmlns:m="http://schemas.openxmlformats.org/officeDocument/2006/math" xmlns:v="urn:schemas-microsoft-com:vml" xmlns:wp14="http://schemas.microsoft.com/office/word/2010/wordprocessingDrawing" xmlns:wp="http://schemas.openxmlformats.org/drawingml/2006/wordprocessingDrawing" xmlns:w10="urn:schemas-microsoft-com:office:word" xmlns:w="http://schemas.openxmlformats.org/wordprocessingml/2006/main" xmlns:w14="http://schemas.microsoft.com/office/word/2010/wordml" xmlns:w15="http://schemas.microsoft.com/office/word/2012/wordml" xmlns:w16cei="http://schemas.microsoft.com/office/word/2026/wordml/cei" xmlns:w16cex="http://schemas.microsoft.com/office/word/2018/wordml/cex" xmlns:w16cid="http://schemas.microsoft.com/office/word/2016/wordml/cid" xmlns:w16="http://schemas.microsoft.com/office/word/2018/wordml" xmlns:w16du="http://schemas.microsoft.com/office/word/2023/wordml/word16du" xmlns:w16sdtdh="http://schemas.microsoft.com/office/word/2020/wordml/sdtdatahash" xmlns:w16sdtfl="http://schemas.microsoft.com/office/word/2024/wordml/sdtformatlock" xmlns:w16se="http://schemas.microsoft.com/office/word/2015/wordml/symex" xmlns:wpg="http://schemas.microsoft.com/office/word/2010/wordprocessingGroup" xmlns:wpi="http://schemas.microsoft.com/office/word/2010/wordprocessingInk" xmlns:wne="http://schemas.microsoft.com/office/word/2006/wordml" xmlns:wps="http://schemas.microsoft.com/office/word/2010/wordprocessingShape" mc:Ignorable="w14 w15 w16se w16cid w16 w16cex w16sdtdh w16sdtfl w16du wp14">
+<w:numbering xmlns:wpc="http://schemas.microsoft.com/office/word/2010/wordprocessingCanvas" xmlns:cx="http://schemas.microsoft.com/office/drawing/2014/chartex" xmlns:cx1="http://schemas.microsoft.com/office/drawing/2015/9/8/chartex" xmlns:cx2="http://schemas.microsoft.com/office/drawing/2015/10/21/chartex" xmlns:cx3="http://schemas.microsoft.com/office/drawing/2016/5/9/chartex" xmlns:cx4="http://schemas.microsoft.com/office/drawing/2016/5/10/chartex" xmlns:cx5="http://schemas.microsoft.com/office/drawing/2016/5/11/chartex" xmlns:cx6="http://schemas.microsoft.com/office/drawing/2016/5/12/chartex" xmlns:cx7="http://schemas.microsoft.com/office/drawing/2016/5/13/chartex" xmlns:cx8="http://schemas.microsoft.com/office/drawing/2016/5/14/chartex" xmlns:mc="http://schemas.openxmlformats.org/markup-compatibility/2006" xmlns:aink="http://schemas.microsoft.com/office/drawing/2016/ink" xmlns:am3d="http://schemas.microsoft.com/office/drawing/2017/model3d" xmlns:o="urn:schemas-microsoft-com:office:office" xmlns:oel="http://schemas.microsoft.com/office/2019/extlst" xmlns:r="http://schemas.openxmlformats.org/officeDocument/2006/relationships" xmlns:m="http://schemas.openxmlformats.org/officeDocument/2006/math" xmlns:v="urn:schemas-microsoft-com:vml" xmlns:wp14="http://schemas.microsoft.com/office/word/2010/wordprocessingDrawing" xmlns:wp="http://schemas.openxmlformats.org/drawingml/2006/wordprocessingDrawing" xmlns:w10="urn:schemas-microsoft-com:office:word" xmlns:w="http://schemas.openxmlformats.org/wordprocessingml/2006/main" xmlns:w14="http://schemas.microsoft.com/office/word/2010/wordml" xmlns:w15="http://schemas.microsoft.com/office/word/2012/wordml" xmlns:w16cex="http://schemas.microsoft.com/office/word/2018/wordml/cex" xmlns:w16cid="http://schemas.microsoft.com/office/word/2016/wordml/cid" xmlns:w16="http://schemas.microsoft.com/office/word/2018/wordml" xmlns:w16du="http://schemas.microsoft.com/office/word/2023/wordml/word16du" xmlns:w16sdtdh="http://schemas.microsoft.com/office/word/2020/wordml/sdtdatahash" xmlns:w16sdtfl="http://schemas.microsoft.com/office/word/2024/wordml/sdtformatlock" xmlns:w16se="http://schemas.microsoft.com/office/word/2015/wordml/symex" xmlns:wpg="http://schemas.microsoft.com/office/word/2010/wordprocessingGroup" xmlns:wpi="http://schemas.microsoft.com/office/word/2010/wordprocessingInk" xmlns:wne="http://schemas.microsoft.com/office/word/2006/wordml" xmlns:wps="http://schemas.microsoft.com/office/word/2010/wordprocessingShape" mc:Ignorable="w14 w15 w16se w16cid w16 w16cex w16sdtdh w16sdtfl w16du wp14">
   <w:abstractNum w:abstractNumId="0" w15:restartNumberingAfterBreak="0">
     <w:nsid w:val="135F5FAE"/>
     <w:multiLevelType w:val="multilevel"/>
@@ -3381,6 +3413,7 @@
   <w:style w:type="character" w:default="1" w:styleId="DefaultParagraphFont">
     <w:name w:val="Default Paragraph Font"/>
     <w:uiPriority w:val="1"/>
+    <w:semiHidden/>
     <w:unhideWhenUsed/>
   </w:style>
   <w:style w:type="table" w:default="1" w:styleId="TableNormal">

</xml_diff>